<commit_message>
1.2.0 (C1–C3): ghi tay văn bản soạn ngoài phần mềm vào Sổ văn bản đi; mẫu 14 Điều 1 theo Mẫu số 44 NĐ 151 (khoản 1, 2 Điều 3 NĐ 88), mẫu 14, R5 thêm trách nhiệm người có đất thu hồi; xem trước biểu Excel phương án
Co-Authored-By: Claude Opus 5.5 <noreply@anthropic.com>
Claude-Session: https://claude.ai/code/session_01BZcswa4gE3voAhFCMjfJc5
</commit_message>
<xml_diff>
--- a/apps/desktop/public/mau-van-ban/mau-14.docx
+++ b/apps/desktop/public/mau-van-ban/mau-14.docx
@@ -375,24 +375,49 @@
           <w:sz w:val="28"/>
           <w:szCs w:val="28"/>
         </w:rPr>
-        <w:t xml:space="preserve"> Phê duyệt phương án bồi thường, hỗ trợ, tái định cư khi Nhà nước thu hồi đất để thực hiện dự án {ten_du_an}, cụ thể như sau:</w:t>
-      </w:r>
-    </w:p>
-    <w:p>
-      <w:pPr>
-        <w:spacing w:after="120" w:before="0" w:line="288" w:lineRule="auto"/>
-        <w:ind w:left="0" w:firstLine="567"/>
-        <w:jc w:val="both"/>
-      </w:pPr>
-      <w:r>
-        <w:rPr>
-          <w:rFonts w:ascii="Times New Roman" w:cs="Times New Roman" w:eastAsia="Times New Roman" w:hAnsi="Times New Roman"/>
-          <w:b/>
-          <w:bCs/>
-          <w:sz w:val="28"/>
-          <w:szCs w:val="28"/>
-        </w:rPr>
-        <w:t xml:space="preserve">1. Tổng diện tích đất thu hồi:</w:t>
+        <w:t xml:space="preserve"> Phê duyệt phương án bồi thường, hỗ trợ, tái định cư khi Nhà nước thu hồi đất để thực hiện dự án {ten_du_an}, bao gồm:</w:t>
+      </w:r>
+    </w:p>
+    <w:p>
+      <w:pPr>
+        <w:spacing w:after="120" w:before="0" w:line="288" w:lineRule="auto"/>
+        <w:ind w:left="0" w:firstLine="567"/>
+        <w:jc w:val="both"/>
+      </w:pPr>
+      <w:r>
+        <w:rPr>
+          <w:rFonts w:ascii="Times New Roman" w:cs="Times New Roman" w:eastAsia="Times New Roman" w:hAnsi="Times New Roman"/>
+          <w:b/>
+          <w:bCs/>
+          <w:sz w:val="28"/>
+          <w:szCs w:val="28"/>
+        </w:rPr>
+        <w:t xml:space="preserve">1. Phương án bồi thường, hỗ trợ, tái định cư đối với dự án</w:t>
+      </w:r>
+      <w:r>
+        <w:rPr>
+          <w:rFonts w:ascii="Times New Roman" w:cs="Times New Roman" w:eastAsia="Times New Roman" w:hAnsi="Times New Roman"/>
+          <w:sz w:val="28"/>
+          <w:szCs w:val="28"/>
+        </w:rPr>
+        <w:t xml:space="preserve"> {ten_du_an} theo quy định tại khoản 1 Điều 3 của Nghị định số 88/2024/NĐ-CP ngày 15 tháng 7 năm 2024 của Chính phủ quy định về bồi thường, hỗ trợ, tái định cư khi Nhà nước thu hồi đất:</w:t>
+      </w:r>
+    </w:p>
+    <w:p>
+      <w:pPr>
+        <w:spacing w:after="120" w:before="0" w:line="288" w:lineRule="auto"/>
+        <w:ind w:left="0" w:firstLine="567"/>
+        <w:jc w:val="both"/>
+      </w:pPr>
+      <w:r>
+        <w:rPr>
+          <w:rFonts w:ascii="Times New Roman" w:cs="Times New Roman" w:eastAsia="Times New Roman" w:hAnsi="Times New Roman"/>
+          <w:b/>
+          <w:bCs/>
+          <w:sz w:val="28"/>
+          <w:szCs w:val="28"/>
+        </w:rPr>
+        <w:t xml:space="preserve">1.1. Tổng diện tích đất thu hồi:</w:t>
       </w:r>
       <w:r>
         <w:rPr>
@@ -462,7 +487,7 @@
           <w:sz w:val="28"/>
           <w:szCs w:val="28"/>
         </w:rPr>
-        <w:t xml:space="preserve">2. Tổng số đối tượng có đất thu hồi:</w:t>
+        <w:t xml:space="preserve">1.2. Tổng số đối tượng có đất thu hồi:</w:t>
       </w:r>
       <w:r>
         <w:rPr>
@@ -487,7 +512,7 @@
           <w:sz w:val="28"/>
           <w:szCs w:val="28"/>
         </w:rPr>
-        <w:t xml:space="preserve">3. Địa điểm:</w:t>
+        <w:t xml:space="preserve">1.3. Địa điểm:</w:t>
       </w:r>
       <w:r>
         <w:rPr>
@@ -512,7 +537,7 @@
           <w:sz w:val="28"/>
           <w:szCs w:val="28"/>
         </w:rPr>
-        <w:t xml:space="preserve">4. Phương án đào tạo, chuyển đổi nghề và tìm kiếm việc làm (nếu có):</w:t>
+        <w:t xml:space="preserve">1.4. Phương án đào tạo, chuyển đổi nghề và tìm kiếm việc làm (nếu có):</w:t>
       </w:r>
       <w:r>
         <w:rPr>
@@ -537,7 +562,7 @@
           <w:sz w:val="28"/>
           <w:szCs w:val="28"/>
         </w:rPr>
-        <w:t xml:space="preserve">5. Phương án bố trí tái định cư (nếu có):</w:t>
+        <w:t xml:space="preserve">1.5. Phương án bố trí tái định cư (nếu có):</w:t>
       </w:r>
       <w:r>
         <w:rPr>
@@ -562,7 +587,7 @@
           <w:sz w:val="28"/>
           <w:szCs w:val="28"/>
         </w:rPr>
-        <w:t xml:space="preserve">6. Phương án bồi thường bằng đất (nếu có):</w:t>
+        <w:t xml:space="preserve">1.6. Phương án bồi thường bằng đất (nếu có):</w:t>
       </w:r>
       <w:r>
         <w:rPr>
@@ -587,7 +612,7 @@
           <w:sz w:val="28"/>
           <w:szCs w:val="28"/>
         </w:rPr>
-        <w:t xml:space="preserve">7. Phương án di dời mồ mả trong phạm vi đất thu hồi (nếu có):</w:t>
+        <w:t xml:space="preserve">1.7. Phương án di dời mồ mả trong phạm vi đất thu hồi (nếu có):</w:t>
       </w:r>
       <w:r>
         <w:rPr>
@@ -612,7 +637,7 @@
           <w:sz w:val="28"/>
           <w:szCs w:val="28"/>
         </w:rPr>
-        <w:t xml:space="preserve">8. Phương án di chuyển các công trình hạ tầng trong phạm vi đất thu hồi (nếu có):</w:t>
+        <w:t xml:space="preserve">1.8. Phương án di chuyển các công trình hạ tầng trong phạm vi đất thu hồi (nếu có):</w:t>
       </w:r>
       <w:r>
         <w:rPr>
@@ -637,7 +662,7 @@
           <w:sz w:val="28"/>
           <w:szCs w:val="28"/>
         </w:rPr>
-        <w:t xml:space="preserve">9. Kinh phí bồi thường, hỗ trợ, tái định cư</w:t>
+        <w:t xml:space="preserve">1.9. Kinh phí bồi thường, hỗ trợ, tái định cư</w:t>
       </w:r>
     </w:p>
     <w:p>
@@ -685,7 +710,7 @@
           <w:sz w:val="28"/>
           <w:szCs w:val="28"/>
         </w:rPr>
-        <w:t xml:space="preserve">9.1. Tiền bồi thường, hỗ trợ, tái định cư khi Nhà nước thu hồi đất: {tien_bthttdc} đồng (bằng chữ: {tien_bthttdc_chu}), gồm:</w:t>
+        <w:t xml:space="preserve">1.9.1. Tiền bồi thường, hỗ trợ, tái định cư khi Nhà nước thu hồi đất: {tien_bthttdc} đồng (bằng chữ: {tien_bthttdc_chu}), gồm:</w:t>
       </w:r>
     </w:p>
     <w:p>
@@ -775,39 +800,39 @@
           <w:sz w:val="28"/>
           <w:szCs w:val="28"/>
         </w:rPr>
-        <w:t xml:space="preserve">9.2. Chi phí bảo đảm cho việc tổ chức thực hiện bồi thường, hỗ trợ, tái định cư: {chi_phi_to_chuc} đồng.</w:t>
-      </w:r>
-    </w:p>
-    <w:p>
-      <w:pPr>
-        <w:spacing w:after="120" w:before="0" w:line="288" w:lineRule="auto"/>
-        <w:ind w:left="0" w:firstLine="567"/>
-        <w:jc w:val="both"/>
-      </w:pPr>
-      <w:r>
-        <w:rPr>
-          <w:rFonts w:ascii="Times New Roman" w:cs="Times New Roman" w:eastAsia="Times New Roman" w:hAnsi="Times New Roman"/>
-          <w:sz w:val="28"/>
-          <w:szCs w:val="28"/>
-        </w:rPr>
-        <w:t xml:space="preserve">9.3. Các chi phí khác: {chi_phi_khac}.</w:t>
-      </w:r>
-    </w:p>
-    <w:p>
-      <w:pPr>
-        <w:spacing w:after="120" w:before="0" w:line="288" w:lineRule="auto"/>
-        <w:ind w:left="0" w:firstLine="567"/>
-        <w:jc w:val="both"/>
-      </w:pPr>
-      <w:r>
-        <w:rPr>
-          <w:rFonts w:ascii="Times New Roman" w:cs="Times New Roman" w:eastAsia="Times New Roman" w:hAnsi="Times New Roman"/>
-          <w:b/>
-          <w:bCs/>
-          <w:sz w:val="28"/>
-          <w:szCs w:val="28"/>
-        </w:rPr>
-        <w:t xml:space="preserve">10. Tiến độ thực hiện phương án bồi thường, hỗ trợ, tái định cư:</w:t>
+        <w:t xml:space="preserve">1.9.2. Chi phí bảo đảm cho việc tổ chức thực hiện bồi thường, hỗ trợ, tái định cư: {chi_phi_to_chuc} đồng.</w:t>
+      </w:r>
+    </w:p>
+    <w:p>
+      <w:pPr>
+        <w:spacing w:after="120" w:before="0" w:line="288" w:lineRule="auto"/>
+        <w:ind w:left="0" w:firstLine="567"/>
+        <w:jc w:val="both"/>
+      </w:pPr>
+      <w:r>
+        <w:rPr>
+          <w:rFonts w:ascii="Times New Roman" w:cs="Times New Roman" w:eastAsia="Times New Roman" w:hAnsi="Times New Roman"/>
+          <w:sz w:val="28"/>
+          <w:szCs w:val="28"/>
+        </w:rPr>
+        <w:t xml:space="preserve">1.9.3. Các chi phí khác: {chi_phi_khac}.</w:t>
+      </w:r>
+    </w:p>
+    <w:p>
+      <w:pPr>
+        <w:spacing w:after="120" w:before="0" w:line="288" w:lineRule="auto"/>
+        <w:ind w:left="0" w:firstLine="567"/>
+        <w:jc w:val="both"/>
+      </w:pPr>
+      <w:r>
+        <w:rPr>
+          <w:rFonts w:ascii="Times New Roman" w:cs="Times New Roman" w:eastAsia="Times New Roman" w:hAnsi="Times New Roman"/>
+          <w:b/>
+          <w:bCs/>
+          <w:sz w:val="28"/>
+          <w:szCs w:val="28"/>
+        </w:rPr>
+        <w:t xml:space="preserve">1.10. Tiến độ thực hiện phương án bồi thường, hỗ trợ, tái định cư:</w:t>
       </w:r>
       <w:r>
         <w:rPr>
@@ -832,7 +857,7 @@
           <w:sz w:val="28"/>
           <w:szCs w:val="28"/>
         </w:rPr>
-        <w:t xml:space="preserve">11. Ý kiến, kiến nghị của tổ chức/hộ gia đình/cá nhân về phương án bồi thường, hỗ trợ và tái định cư; kết quả giải quyết (nếu có):</w:t>
+        <w:t xml:space="preserve">1.11. Ý kiến, kiến nghị của tổ chức/hộ gia đình/cá nhân về phương án bồi thường, hỗ trợ và tái định cư; kết quả giải quyết (nếu có):</w:t>
       </w:r>
       <w:r>
         <w:rPr>
@@ -857,7 +882,32 @@
           <w:sz w:val="28"/>
           <w:szCs w:val="28"/>
         </w:rPr>
-        <w:t xml:space="preserve">12. Các nội dung khác liên quan đến bồi thường, hỗ trợ, tái định cư (nếu có):</w:t>
+        <w:t xml:space="preserve">2. Phương án chi tiết bồi thường, hỗ trợ, tái định cư đối với từng người có đất thu hồi, chủ sở hữu tài sản</w:t>
+      </w:r>
+      <w:r>
+        <w:rPr>
+          <w:rFonts w:ascii="Times New Roman" w:cs="Times New Roman" w:eastAsia="Times New Roman" w:hAnsi="Times New Roman"/>
+          <w:sz w:val="28"/>
+          <w:szCs w:val="28"/>
+        </w:rPr>
+        <w:t xml:space="preserve"> theo quy định tại khoản 2 Điều 3 của Nghị định số 88/2024/NĐ-CP ngày 15 tháng 7 năm 2024 của Chính phủ (có Phụ lục chi tiết kèm theo).</w:t>
+      </w:r>
+    </w:p>
+    <w:p>
+      <w:pPr>
+        <w:spacing w:after="120" w:before="0" w:line="288" w:lineRule="auto"/>
+        <w:ind w:left="0" w:firstLine="567"/>
+        <w:jc w:val="both"/>
+      </w:pPr>
+      <w:r>
+        <w:rPr>
+          <w:rFonts w:ascii="Times New Roman" w:cs="Times New Roman" w:eastAsia="Times New Roman" w:hAnsi="Times New Roman"/>
+          <w:b/>
+          <w:bCs/>
+          <w:sz w:val="28"/>
+          <w:szCs w:val="28"/>
+        </w:rPr>
+        <w:t xml:space="preserve">3. Các nội dung khác (nếu có):</w:t>
       </w:r>
       <w:r>
         <w:rPr>
@@ -871,23 +921,6 @@
     <w:p>
       <w:pPr>
         <w:spacing w:after="120" w:before="0" w:line="288" w:lineRule="auto"/>
-        <w:ind w:left="0" w:firstLine="0"/>
-        <w:jc w:val="center"/>
-      </w:pPr>
-      <w:r>
-        <w:rPr>
-          <w:rFonts w:ascii="Times New Roman" w:cs="Times New Roman" w:eastAsia="Times New Roman" w:hAnsi="Times New Roman"/>
-          <w:i/>
-          <w:iCs/>
-          <w:sz w:val="28"/>
-          <w:szCs w:val="28"/>
-        </w:rPr>
-        <w:t xml:space="preserve">(Có phương án bồi thường, hỗ trợ và tái định cư chi tiết kèm theo)</w:t>
-      </w:r>
-    </w:p>
-    <w:p>
-      <w:pPr>
-        <w:spacing w:after="120" w:before="0" w:line="288" w:lineRule="auto"/>
         <w:ind w:left="0" w:firstLine="567"/>
         <w:jc w:val="both"/>
       </w:pPr>
@@ -953,6 +986,21 @@
           <w:szCs w:val="28"/>
         </w:rPr>
         <w:t xml:space="preserve">3. Văn phòng {co_quan_dang_tai} có trách nhiệm đăng tải quyết định này trên trang thông tin điện tử của Ủy ban nhân dân {ten_xa}.</w:t>
+      </w:r>
+    </w:p>
+    <w:p>
+      <w:pPr>
+        <w:spacing w:after="120" w:before="0" w:line="288" w:lineRule="auto"/>
+        <w:ind w:left="0" w:firstLine="567"/>
+        <w:jc w:val="both"/>
+      </w:pPr>
+      <w:r>
+        <w:rPr>
+          <w:rFonts w:ascii="Times New Roman" w:cs="Times New Roman" w:eastAsia="Times New Roman" w:hAnsi="Times New Roman"/>
+          <w:sz w:val="28"/>
+          <w:szCs w:val="28"/>
+        </w:rPr>
+        <w:t xml:space="preserve">4. {trach_nhiem_nguoi_co_dat}</w:t>
       </w:r>
     </w:p>
     <w:p>

</xml_diff>